<commit_message>
Refine blue light vehicle detection
</commit_message>
<xml_diff>
--- a/blue-light-detection/解题技术思路和最优方案报告.docx
+++ b/blue-light-detection/解题技术思路和最优方案报告.docx
@@ -46,16 +46,16 @@
         <w:rPr>
           <w:rFonts w:hint="eastAsia"/>
         </w:rPr>
-        <w:t xml:space="preserve">本方案采用“图像增强</w:t>
-      </w:r>
-      <w:r>
-        <w:t xml:space="preserve"> + HSV </w:t>
-      </w:r>
-      <w:r>
-        <w:rPr>
-          <w:rFonts w:hint="eastAsia"/>
-        </w:rPr>
-        <w:t xml:space="preserve">蓝光分割</w:t>
+        <w:t xml:space="preserve">本方案采用“图像预处理</w:t>
+      </w:r>
+      <w:r>
+        <w:t xml:space="preserve"> + YOLO </w:t>
+      </w:r>
+      <w:r>
+        <w:rPr>
+          <w:rFonts w:hint="eastAsia"/>
+        </w:rPr>
+        <w:t xml:space="preserve">车辆检测</w:t>
       </w:r>
       <w:r>
         <w:t xml:space="preserve"> + </w:t>
@@ -64,7 +64,7 @@
         <w:rPr>
           <w:rFonts w:hint="eastAsia"/>
         </w:rPr>
-        <w:t xml:space="preserve">形态学去噪</w:t>
+        <w:t xml:space="preserve">小型高亮蓝光候选提取</w:t>
       </w:r>
       <w:r>
         <w:t xml:space="preserve"> + </w:t>
@@ -73,7 +73,7 @@
         <w:rPr>
           <w:rFonts w:hint="eastAsia"/>
         </w:rPr>
-        <w:t xml:space="preserve">轻量车辆检测</w:t>
+        <w:t xml:space="preserve">成对车灯反推车辆候选</w:t>
       </w:r>
       <w:r>
         <w:t xml:space="preserve"> + </w:t>
@@ -82,7 +82,7 @@
         <w:rPr>
           <w:rFonts w:hint="eastAsia"/>
         </w:rPr>
-        <w:t xml:space="preserve">蓝光-车辆空间关联</w:t>
+        <w:t xml:space="preserve">车身结构验证</w:t>
       </w:r>
       <w:r>
         <w:t xml:space="preserve"> + </w:t>
@@ -91,7 +91,27 @@
         <w:rPr>
           <w:rFonts w:hint="eastAsia"/>
         </w:rPr>
-        <w:t xml:space="preserve">干扰过滤”的组合算法。传统图像处理负责提取颜色与亮度特征，AI</w:t>
+        <w:t xml:space="preserve">车辆蓝光来源分类”的组合算法。算法设计的核心原则是：蓝光检测必须以车辆为主体，既要识别蓝光车灯车辆，也要识别车身、挡风玻璃、号牌附近的蓝光反光车辆，同时过滤路牌、路灯等环境干扰蓝光。</w:t>
+      </w:r>
+    </w:p>
+    <w:p>
+      <w:pPr>
+        <w:pStyle w:val="BodyText"/>
+      </w:pPr>
+      <w:r>
+        <w:rPr>
+          <w:rFonts w:hint="eastAsia"/>
+        </w:rPr>
+        <w:t xml:space="preserve">因此，系统先用</w:t>
+      </w:r>
+      <w:r>
+        <w:t xml:space="preserve"> YOLOv8n </w:t>
+      </w:r>
+      <w:r>
+        <w:rPr>
+          <w:rFonts w:hint="eastAsia"/>
+        </w:rPr>
+        <w:t xml:space="preserve">获取明显车辆框；对于夜间远处车辆，由于车身可能很暗、YOLO</w:t>
       </w:r>
       <w:r>
         <w:t xml:space="preserve"> </w:t>
@@ -100,7 +120,7 @@
         <w:rPr>
           <w:rFonts w:hint="eastAsia"/>
         </w:rPr>
-        <w:t xml:space="preserve">目标检测负责提供车辆空间先验，两者结合可以避免单独颜色阈值造成的大量环境误检。</w:t>
+        <w:t xml:space="preserve">容易漏检，算法再从小型高亮光斑中寻找左右成对、位置接近水平、尺寸相近的车灯组合，并由该组合反推车辆候选框。随后对反推候选框进行车身暗部和边缘结构验证，过滤路面标线、灯箱、路牌和柱体反光。最终在车辆框内根据蓝光区域的相对位置和形态，将车辆分为蓝光车灯车辆和蓝光反光车辆。</w:t>
       </w:r>
     </w:p>
     <w:bookmarkEnd w:id="20"/>
@@ -139,7 +159,7 @@
         <w:rPr>
           <w:rFonts w:hint="eastAsia"/>
         </w:rPr>
-        <w:t xml:space="preserve">首先对输入图像进行高斯滤波，抑制传感器噪声和压缩噪声；随后在</w:t>
+        <w:t xml:space="preserve">输入图像先经过高斯滤波降低噪声，再转换到</w:t>
       </w:r>
       <w:r>
         <w:t xml:space="preserve"> LAB </w:t>
@@ -148,7 +168,7 @@
         <w:rPr>
           <w:rFonts w:hint="eastAsia"/>
         </w:rPr>
-        <w:t xml:space="preserve">空间对亮度通道使用</w:t>
+        <w:t xml:space="preserve">空间，对亮度通道使用</w:t>
       </w:r>
       <w:r>
         <w:t xml:space="preserve"> CLAHE </w:t>
@@ -157,11 +177,11 @@
         <w:rPr>
           <w:rFonts w:hint="eastAsia"/>
         </w:rPr>
-        <w:t xml:space="preserve">局部直方图均衡，增强夜间和逆光场景下的局部对比度。</w:t>
+        <w:t xml:space="preserve">局部直方图均衡。该步骤用于增强夜间弱车身边缘和局部光斑对比度，避免远处车辆在暗背景中完全丢失。</w:t>
       </w:r>
     </w:p>
     <w:bookmarkEnd w:id="21"/>
-    <w:bookmarkStart w:id="22" w:name="蓝光特征分割"/>
+    <w:bookmarkStart w:id="22" w:name="基础车辆检测"/>
     <w:p>
       <w:pPr>
         <w:pStyle w:val="Heading4"/>
@@ -173,7 +193,7 @@
         <w:rPr>
           <w:rFonts w:hint="eastAsia"/>
         </w:rPr>
-        <w:t xml:space="preserve">蓝光特征分割</w:t>
+        <w:t xml:space="preserve">基础车辆检测</w:t>
       </w:r>
     </w:p>
     <w:p>
@@ -184,43 +204,7 @@
         <w:rPr>
           <w:rFonts w:hint="eastAsia"/>
         </w:rPr>
-        <w:t xml:space="preserve">将图像转换到</w:t>
-      </w:r>
-      <w:r>
-        <w:t xml:space="preserve"> HSV </w:t>
-      </w:r>
-      <w:r>
-        <w:rPr>
-          <w:rFonts w:hint="eastAsia"/>
-        </w:rPr>
-        <w:t xml:space="preserve">空间，利用色相</w:t>
-      </w:r>
-      <w:r>
-        <w:t xml:space="preserve"> H </w:t>
-      </w:r>
-      <w:r>
-        <w:rPr>
-          <w:rFonts w:hint="eastAsia"/>
-        </w:rPr>
-        <w:t xml:space="preserve">限定蓝色范围，并结合饱和度</w:t>
-      </w:r>
-      <w:r>
-        <w:t xml:space="preserve"> S </w:t>
-      </w:r>
-      <w:r>
-        <w:rPr>
-          <w:rFonts w:hint="eastAsia"/>
-        </w:rPr>
-        <w:t xml:space="preserve">和亮度</w:t>
-      </w:r>
-      <w:r>
-        <w:t xml:space="preserve"> V </w:t>
-      </w:r>
-      <w:r>
-        <w:rPr>
-          <w:rFonts w:hint="eastAsia"/>
-        </w:rPr>
-        <w:t xml:space="preserve">筛选高亮蓝光区域。为适应不同光照，S、V</w:t>
+        <w:t xml:space="preserve">车辆检测模块优先调用</w:t>
       </w:r>
       <w:r>
         <w:t xml:space="preserve"> </w:t>
@@ -229,11 +213,29 @@
         <w:rPr>
           <w:rFonts w:hint="eastAsia"/>
         </w:rPr>
-        <w:t xml:space="preserve">阈值可由图像分位数自适应得到。</w:t>
+        <w:t xml:space="preserve">YOLOv8n，识别</w:t>
+      </w:r>
+      <w:r>
+        <w:t xml:space="preserve"> COCO </w:t>
+      </w:r>
+      <w:r>
+        <w:rPr>
+          <w:rFonts w:hint="eastAsia"/>
+        </w:rPr>
+        <w:t xml:space="preserve">类别中的</w:t>
+      </w:r>
+      <w:r>
+        <w:t xml:space="preserve"> car、motorcycle、bus、truck。YOLO </w:t>
+      </w:r>
+      <w:r>
+        <w:rPr>
+          <w:rFonts w:hint="eastAsia"/>
+        </w:rPr>
+        <w:t xml:space="preserve">检测到的车辆框作为最可靠的车辆先验，后续蓝光区域必须落在这些车辆框内，或者落在由成对车灯反推得到的车辆候选框内。</w:t>
       </w:r>
     </w:p>
     <w:bookmarkEnd w:id="22"/>
-    <w:bookmarkStart w:id="23" w:name="形态学去噪"/>
+    <w:bookmarkStart w:id="23" w:name="小型高亮蓝光候选提取"/>
     <w:p>
       <w:pPr>
         <w:pStyle w:val="Heading4"/>
@@ -245,7 +247,7 @@
         <w:rPr>
           <w:rFonts w:hint="eastAsia"/>
         </w:rPr>
-        <w:t xml:space="preserve">形态学去噪</w:t>
+        <w:t xml:space="preserve">小型高亮蓝光候选提取</w:t>
       </w:r>
     </w:p>
     <w:p>
@@ -256,11 +258,11 @@
         <w:rPr>
           <w:rFonts w:hint="eastAsia"/>
         </w:rPr>
-        <w:t xml:space="preserve">对二值蓝光掩码执行开运算去除零散噪点，执行闭运算连接破碎蓝光区域，再通过面积阈值过滤过小区域。</w:t>
+        <w:t xml:space="preserve">算法在灰度亮度图上提取高亮光斑：先根据图像亮度分位数获得自适应亮度阈值，再使用局部背景差分提取相对周围明显突出的亮点。随后通过连通域面积、宽高比和填充率过滤大面积灯箱、长条灯、路牌文字和噪声点，得到蓝光候选区域。候选区域后续必须与车辆空间关系结合，才能判定为车灯蓝光或车辆反光蓝光。</w:t>
       </w:r>
     </w:p>
     <w:bookmarkEnd w:id="23"/>
-    <w:bookmarkStart w:id="24" w:name="车辆检测"/>
+    <w:bookmarkStart w:id="24" w:name="成对车灯反推车辆候选"/>
     <w:p>
       <w:pPr>
         <w:pStyle w:val="Heading4"/>
@@ -272,7 +274,7 @@
         <w:rPr>
           <w:rFonts w:hint="eastAsia"/>
         </w:rPr>
-        <w:t xml:space="preserve">车辆检测</w:t>
+        <w:t xml:space="preserve">成对车灯反推车辆候选</w:t>
       </w:r>
     </w:p>
     <w:p>
@@ -283,29 +285,91 @@
         <w:rPr>
           <w:rFonts w:hint="eastAsia"/>
         </w:rPr>
-        <w:t xml:space="preserve">优先使用</w:t>
-      </w:r>
-      <w:r>
-        <w:t xml:space="preserve"> YOLOv8n </w:t>
-      </w:r>
-      <w:r>
-        <w:rPr>
-          <w:rFonts w:hint="eastAsia"/>
-        </w:rPr>
-        <w:t xml:space="preserve">轻量目标检测模型识别</w:t>
-      </w:r>
-      <w:r>
-        <w:t xml:space="preserve"> car、motorcycle、bus、truck </w:t>
-      </w:r>
-      <w:r>
-        <w:rPr>
-          <w:rFonts w:hint="eastAsia"/>
-        </w:rPr>
-        <w:t xml:space="preserve">等车辆类别；若环境没有模型依赖，则退化为基于边缘和轮廓的候选车辆检测，保证代码可运行和流程可演示。</w:t>
+        <w:t xml:space="preserve">远处车辆常常车身不明显，但左右车灯同时可见。因此算法对小型高亮候选进行两两匹配，只有满足以下条件的光斑对才会生成车辆候选框：</w:t>
+      </w:r>
+    </w:p>
+    <w:p>
+      <w:pPr>
+        <w:pStyle w:val="Compact"/>
+        <w:numPr>
+          <w:ilvl w:val="0"/>
+          <w:numId w:val="1001"/>
+        </w:numPr>
+      </w:pPr>
+      <w:r>
+        <w:rPr>
+          <w:rFonts w:hint="eastAsia"/>
+        </w:rPr>
+        <w:t xml:space="preserve">两个光斑近似水平排列，垂直偏差较小；</w:t>
+      </w:r>
+    </w:p>
+    <w:p>
+      <w:pPr>
+        <w:pStyle w:val="Compact"/>
+        <w:numPr>
+          <w:ilvl w:val="0"/>
+          <w:numId w:val="1001"/>
+        </w:numPr>
+      </w:pPr>
+      <w:r>
+        <w:rPr>
+          <w:rFonts w:hint="eastAsia"/>
+        </w:rPr>
+        <w:t xml:space="preserve">两个光斑面积差异不能过大；</w:t>
+      </w:r>
+    </w:p>
+    <w:p>
+      <w:pPr>
+        <w:pStyle w:val="Compact"/>
+        <w:numPr>
+          <w:ilvl w:val="0"/>
+          <w:numId w:val="1001"/>
+        </w:numPr>
+      </w:pPr>
+      <w:r>
+        <w:rPr>
+          <w:rFonts w:hint="eastAsia"/>
+        </w:rPr>
+        <w:t xml:space="preserve">两个光斑间距处于合理车灯间距范围；</w:t>
+      </w:r>
+    </w:p>
+    <w:p>
+      <w:pPr>
+        <w:pStyle w:val="Compact"/>
+        <w:numPr>
+          <w:ilvl w:val="0"/>
+          <w:numId w:val="1001"/>
+        </w:numPr>
+      </w:pPr>
+      <w:r>
+        <w:rPr>
+          <w:rFonts w:hint="eastAsia"/>
+        </w:rPr>
+        <w:t xml:space="preserve">光斑位置位于道路可能区域，排除明显建筑屏幕区域。</w:t>
+      </w:r>
+    </w:p>
+    <w:p>
+      <w:pPr>
+        <w:pStyle w:val="FirstParagraph"/>
+      </w:pPr>
+      <w:r>
+        <w:rPr>
+          <w:rFonts w:hint="eastAsia"/>
+        </w:rPr>
+        <w:t xml:space="preserve">根据光斑中心点和间距估计车辆候选框宽高，作为</w:t>
+      </w:r>
+      <w:r>
+        <w:t xml:space="preserve"> YOLO </w:t>
+      </w:r>
+      <w:r>
+        <w:rPr>
+          <w:rFonts w:hint="eastAsia"/>
+        </w:rPr>
+        <w:t xml:space="preserve">漏检车辆的补充。</w:t>
       </w:r>
     </w:p>
     <w:bookmarkEnd w:id="24"/>
-    <w:bookmarkStart w:id="25" w:name="蓝光关联匹配"/>
+    <w:bookmarkStart w:id="25" w:name="车身结构验证"/>
     <w:p>
       <w:pPr>
         <w:pStyle w:val="Heading4"/>
@@ -317,7 +381,7 @@
         <w:rPr>
           <w:rFonts w:hint="eastAsia"/>
         </w:rPr>
-        <w:t xml:space="preserve">蓝光关联匹配</w:t>
+        <w:t xml:space="preserve">车身结构验证</w:t>
       </w:r>
     </w:p>
     <w:p>
@@ -328,11 +392,52 @@
         <w:rPr>
           <w:rFonts w:hint="eastAsia"/>
         </w:rPr>
-        <w:t xml:space="preserve">对每个蓝光区域计算其落入车辆框内部的比例。若包含比例超过阈值，则判定为车辆相关蓝光；否则标记为路牌、路灯或路面反光等环境蓝光干扰。</w:t>
+        <w:t xml:space="preserve">仅有成对亮点仍不足以证明是车辆，因为地面标线和路面反射也可能形成成对高亮。因此，算法对反推车辆候选框检查两类结构证据：</w:t>
+      </w:r>
+    </w:p>
+    <w:p>
+      <w:pPr>
+        <w:pStyle w:val="Compact"/>
+        <w:numPr>
+          <w:ilvl w:val="0"/>
+          <w:numId w:val="1002"/>
+        </w:numPr>
+      </w:pPr>
+      <w:r>
+        <w:rPr>
+          <w:rFonts w:hint="eastAsia"/>
+        </w:rPr>
+        <w:t xml:space="preserve">暗部比例：车辆候选框内应存在一定比例的暗色车身或阴影区域；</w:t>
+      </w:r>
+    </w:p>
+    <w:p>
+      <w:pPr>
+        <w:pStyle w:val="Compact"/>
+        <w:numPr>
+          <w:ilvl w:val="0"/>
+          <w:numId w:val="1002"/>
+        </w:numPr>
+      </w:pPr>
+      <w:r>
+        <w:rPr>
+          <w:rFonts w:hint="eastAsia"/>
+        </w:rPr>
+        <w:t xml:space="preserve">边缘比例：车辆候选框内应存在车身轮廓、车窗、保险杠等边缘结构。</w:t>
+      </w:r>
+    </w:p>
+    <w:p>
+      <w:pPr>
+        <w:pStyle w:val="FirstParagraph"/>
+      </w:pPr>
+      <w:r>
+        <w:rPr>
+          <w:rFonts w:hint="eastAsia"/>
+        </w:rPr>
+        <w:t xml:space="preserve">如果候选框内部几乎全是亮地面或缺少边缘结构，则判定为环境反光，不生成车辆候选。</w:t>
       </w:r>
     </w:p>
     <w:bookmarkEnd w:id="25"/>
-    <w:bookmarkStart w:id="26" w:name="蓝光来源定位"/>
+    <w:bookmarkStart w:id="26" w:name="车辆蓝光来源分类"/>
     <w:p>
       <w:pPr>
         <w:pStyle w:val="Heading4"/>
@@ -344,7 +449,7 @@
         <w:rPr>
           <w:rFonts w:hint="eastAsia"/>
         </w:rPr>
-        <w:t xml:space="preserve">蓝光来源定位</w:t>
+        <w:t xml:space="preserve">车辆蓝光来源分类</w:t>
       </w:r>
     </w:p>
     <w:p>
@@ -355,7 +460,7 @@
         <w:rPr>
           <w:rFonts w:hint="eastAsia"/>
         </w:rPr>
-        <w:t xml:space="preserve">根据蓝光区域中心点在车辆框内的相对坐标，粗分为左侧车灯蓝光、右侧车灯蓝光、车灯/车牌附近蓝光和车身/挡风玻璃反光。</w:t>
+        <w:t xml:space="preserve">对每个车辆框，先判断蓝光候选是否落入车辆内部。位于前灯/尾灯区域、且呈小型强光核心的候选判定为车灯蓝光，对应车辆使用红色框标注；位于车身、挡风玻璃或号牌附近的候选判定为车辆蓝光反光，对应车辆使用黄色框标注。未与车辆形成可靠空间关系的路牌、路灯、屏幕、柱体和地面反射判定为环境干扰蓝光并过滤。</w:t>
       </w:r>
     </w:p>
     <w:bookmarkEnd w:id="26"/>
@@ -439,13 +544,10 @@
               <w:pStyle w:val="Compact"/>
             </w:pPr>
             <w:r>
-              <w:t xml:space="preserve">HSV </w:t>
-            </w:r>
-            <w:r>
               <w:rPr>
                 <w:rFonts w:hint="eastAsia"/>
               </w:rPr>
-              <w:t xml:space="preserve">色相范围</w:t>
+              <w:t xml:space="preserve">高亮阈值</w:t>
             </w:r>
           </w:p>
         </w:tc>
@@ -457,7 +559,7 @@
               <w:jc w:val="right"/>
             </w:pPr>
             <w:r>
-              <w:t xml:space="preserve">H=85~135</w:t>
+              <w:t xml:space="preserve">max(185, P98.5(gray))</w:t>
             </w:r>
           </w:p>
         </w:tc>
@@ -471,7 +573,7 @@
               <w:rPr>
                 <w:rFonts w:hint="eastAsia"/>
               </w:rPr>
-              <w:t xml:space="preserve">覆盖常见蓝光区域</w:t>
+              <w:t xml:space="preserve">提取夜间高亮光斑候选</w:t>
             </w:r>
           </w:p>
         </w:tc>
@@ -487,7 +589,7 @@
               <w:rPr>
                 <w:rFonts w:hint="eastAsia"/>
               </w:rPr>
-              <w:t xml:space="preserve">自适应亮度阈值</w:t>
+              <w:t xml:space="preserve">局部对比度阈值</w:t>
             </w:r>
           </w:p>
         </w:tc>
@@ -499,7 +601,7 @@
               <w:jc w:val="right"/>
             </w:pPr>
             <w:r>
-              <w:t xml:space="preserve">V_min=max(120, P75(V))</w:t>
+              <w:t xml:space="preserve">contrast ≥ 22</w:t>
             </w:r>
           </w:p>
         </w:tc>
@@ -513,7 +615,7 @@
               <w:rPr>
                 <w:rFonts w:hint="eastAsia"/>
               </w:rPr>
-              <w:t xml:space="preserve">适配白天弱蓝光和夜间强蓝光</w:t>
+              <w:t xml:space="preserve">保留相对周围突出的光点</w:t>
             </w:r>
           </w:p>
         </w:tc>
@@ -529,7 +631,7 @@
               <w:rPr>
                 <w:rFonts w:hint="eastAsia"/>
               </w:rPr>
-              <w:t xml:space="preserve">自适应饱和度阈值</w:t>
+              <w:t xml:space="preserve">光斑面积范围</w:t>
             </w:r>
           </w:p>
         </w:tc>
@@ -541,7 +643,22 @@
               <w:jc w:val="right"/>
             </w:pPr>
             <w:r>
-              <w:t xml:space="preserve">S_min=max(55, P55(S))</w:t>
+              <w:t xml:space="preserve">4 </w:t>
+            </w:r>
+            <w:r>
+              <w:rPr>
+                <w:rFonts w:hint="eastAsia"/>
+              </w:rPr>
+              <w:t xml:space="preserve">像素到</w:t>
+            </w:r>
+            <w:r>
+              <w:t xml:space="preserve"> 0.3% </w:t>
+            </w:r>
+            <w:r>
+              <w:rPr>
+                <w:rFonts w:hint="eastAsia"/>
+              </w:rPr>
+              <w:t xml:space="preserve">图像面积</w:t>
             </w:r>
           </w:p>
         </w:tc>
@@ -555,7 +672,7 @@
               <w:rPr>
                 <w:rFonts w:hint="eastAsia"/>
               </w:rPr>
-              <w:t xml:space="preserve">过滤灰白高亮区域</w:t>
+              <w:t xml:space="preserve">过滤噪声点和大面积灯箱/路牌</w:t>
             </w:r>
           </w:p>
         </w:tc>
@@ -571,7 +688,7 @@
               <w:rPr>
                 <w:rFonts w:hint="eastAsia"/>
               </w:rPr>
-              <w:t xml:space="preserve">形态学核</w:t>
+              <w:t xml:space="preserve">光斑宽高比</w:t>
             </w:r>
           </w:p>
         </w:tc>
@@ -583,13 +700,16 @@
               <w:jc w:val="right"/>
             </w:pPr>
             <w:r>
-              <w:t xml:space="preserve">3×3 </w:t>
+              <w:t xml:space="preserve">0.25 </w:t>
             </w:r>
             <w:r>
               <w:rPr>
                 <w:rFonts w:hint="eastAsia"/>
               </w:rPr>
-              <w:t xml:space="preserve">椭圆核</w:t>
+              <w:t xml:space="preserve">到</w:t>
+            </w:r>
+            <w:r>
+              <w:t xml:space="preserve"> 4.5</w:t>
             </w:r>
           </w:p>
         </w:tc>
@@ -603,7 +723,7 @@
               <w:rPr>
                 <w:rFonts w:hint="eastAsia"/>
               </w:rPr>
-              <w:t xml:space="preserve">兼顾噪点去除和小车灯保留</w:t>
+              <w:t xml:space="preserve">保留车辆蓝光候选亮斑</w:t>
             </w:r>
           </w:p>
         </w:tc>
@@ -619,7 +739,7 @@
               <w:rPr>
                 <w:rFonts w:hint="eastAsia"/>
               </w:rPr>
-              <w:t xml:space="preserve">蓝光最小面积</w:t>
+              <w:t xml:space="preserve">成对车灯水平偏差</w:t>
             </w:r>
           </w:p>
         </w:tc>
@@ -631,13 +751,7 @@
               <w:jc w:val="right"/>
             </w:pPr>
             <w:r>
-              <w:t xml:space="preserve">35 </w:t>
-            </w:r>
-            <w:r>
-              <w:rPr>
-                <w:rFonts w:hint="eastAsia"/>
-              </w:rPr>
-              <w:t xml:space="preserve">像素</w:t>
+              <w:t xml:space="preserve">dy ≤ max(5, 0.25×dx)</w:t>
             </w:r>
           </w:p>
         </w:tc>
@@ -651,7 +765,7 @@
               <w:rPr>
                 <w:rFonts w:hint="eastAsia"/>
               </w:rPr>
-              <w:t xml:space="preserve">过滤孤立噪点</w:t>
+              <w:t xml:space="preserve">约束左右车灯近似水平</w:t>
             </w:r>
           </w:p>
         </w:tc>
@@ -667,7 +781,7 @@
               <w:rPr>
                 <w:rFonts w:hint="eastAsia"/>
               </w:rPr>
-              <w:t xml:space="preserve">车辆关联阈值</w:t>
+              <w:t xml:space="preserve">成对车灯间距</w:t>
             </w:r>
           </w:p>
         </w:tc>
@@ -679,13 +793,22 @@
               <w:jc w:val="right"/>
             </w:pPr>
             <w:r>
+              <w:t xml:space="preserve">10 </w:t>
+            </w:r>
+            <w:r>
               <w:rPr>
                 <w:rFonts w:hint="eastAsia"/>
               </w:rPr>
-              <w:t xml:space="preserve">包含比例</w:t>
-            </w:r>
-            <w:r>
-              <w:t xml:space="preserve"> ≥ 0.45</w:t>
+              <w:t xml:space="preserve">到</w:t>
+            </w:r>
+            <w:r>
+              <w:t xml:space="preserve"> 70 </w:t>
+            </w:r>
+            <w:r>
+              <w:rPr>
+                <w:rFonts w:hint="eastAsia"/>
+              </w:rPr>
+              <w:t xml:space="preserve">像素</w:t>
             </w:r>
           </w:p>
         </w:tc>
@@ -699,7 +822,91 @@
               <w:rPr>
                 <w:rFonts w:hint="eastAsia"/>
               </w:rPr>
-              <w:t xml:space="preserve">判断蓝光是否属于车辆</w:t>
+              <w:t xml:space="preserve">适配远处车辆灯距</w:t>
+            </w:r>
+          </w:p>
+        </w:tc>
+      </w:tr>
+      <w:tr>
+        <w:tc>
+          <w:tcPr/>
+          <w:p>
+            <w:pPr>
+              <w:pStyle w:val="Compact"/>
+            </w:pPr>
+            <w:r>
+              <w:rPr>
+                <w:rFonts w:hint="eastAsia"/>
+              </w:rPr>
+              <w:t xml:space="preserve">车身暗部比例</w:t>
+            </w:r>
+          </w:p>
+        </w:tc>
+        <w:tc>
+          <w:tcPr/>
+          <w:p>
+            <w:pPr>
+              <w:pStyle w:val="Compact"/>
+              <w:jc w:val="right"/>
+            </w:pPr>
+            <w:r>
+              <w:t xml:space="preserve">≥ 0.04</w:t>
+            </w:r>
+          </w:p>
+        </w:tc>
+        <w:tc>
+          <w:tcPr/>
+          <w:p>
+            <w:pPr>
+              <w:pStyle w:val="Compact"/>
+            </w:pPr>
+            <w:r>
+              <w:rPr>
+                <w:rFonts w:hint="eastAsia"/>
+              </w:rPr>
+              <w:t xml:space="preserve">排除纯路面反光和标线高亮</w:t>
+            </w:r>
+          </w:p>
+        </w:tc>
+      </w:tr>
+      <w:tr>
+        <w:tc>
+          <w:tcPr/>
+          <w:p>
+            <w:pPr>
+              <w:pStyle w:val="Compact"/>
+            </w:pPr>
+            <w:r>
+              <w:rPr>
+                <w:rFonts w:hint="eastAsia"/>
+              </w:rPr>
+              <w:t xml:space="preserve">车身边缘比例</w:t>
+            </w:r>
+          </w:p>
+        </w:tc>
+        <w:tc>
+          <w:tcPr/>
+          <w:p>
+            <w:pPr>
+              <w:pStyle w:val="Compact"/>
+              <w:jc w:val="right"/>
+            </w:pPr>
+            <w:r>
+              <w:t xml:space="preserve">≥ 0.07</w:t>
+            </w:r>
+          </w:p>
+        </w:tc>
+        <w:tc>
+          <w:tcPr/>
+          <w:p>
+            <w:pPr>
+              <w:pStyle w:val="Compact"/>
+            </w:pPr>
+            <w:r>
+              <w:rPr>
+                <w:rFonts w:hint="eastAsia"/>
+              </w:rPr>
+              <w:t xml:space="preserve">确认候选框内存在车辆结构</w:t>
             </w:r>
           </w:p>
         </w:tc>
@@ -752,7 +959,7 @@
         <w:pStyle w:val="Compact"/>
         <w:numPr>
           <w:ilvl w:val="0"/>
-          <w:numId w:val="1001"/>
+          <w:numId w:val="1003"/>
         </w:numPr>
       </w:pPr>
       <w:r>
@@ -765,7 +972,7 @@
         <w:rPr>
           <w:rFonts w:hint="eastAsia"/>
         </w:rPr>
-        <w:t xml:space="preserve">：程序入口，支持图片和视频输入，负责结果输出。</w:t>
+        <w:t xml:space="preserve">：程序入口，支持图片输入，并保留视频逐帧处理函数；当前作业输出以图片结果为主。</w:t>
       </w:r>
     </w:p>
     <w:p>
@@ -773,7 +980,7 @@
         <w:pStyle w:val="Compact"/>
         <w:numPr>
           <w:ilvl w:val="0"/>
-          <w:numId w:val="1001"/>
+          <w:numId w:val="1003"/>
         </w:numPr>
       </w:pPr>
       <w:r>
@@ -803,7 +1010,7 @@
         <w:pStyle w:val="Compact"/>
         <w:numPr>
           <w:ilvl w:val="0"/>
-          <w:numId w:val="1001"/>
+          <w:numId w:val="1003"/>
         </w:numPr>
       </w:pPr>
       <w:r>
@@ -816,7 +1023,7 @@
         <w:rPr>
           <w:rFonts w:hint="eastAsia"/>
         </w:rPr>
-        <w:t xml:space="preserve">：蓝光预处理、分割、区域提取和车辆关联匹配。</w:t>
+        <w:t xml:space="preserve">：图像预处理、蓝光候选提取、成对车灯车辆补检、车身结构验证和车辆蓝光来源分类。</w:t>
       </w:r>
     </w:p>
     <w:p>
@@ -824,7 +1031,7 @@
         <w:pStyle w:val="Compact"/>
         <w:numPr>
           <w:ilvl w:val="0"/>
-          <w:numId w:val="1001"/>
+          <w:numId w:val="1003"/>
         </w:numPr>
       </w:pPr>
       <w:r>
@@ -854,7 +1061,7 @@
         <w:pStyle w:val="Compact"/>
         <w:numPr>
           <w:ilvl w:val="0"/>
-          <w:numId w:val="1001"/>
+          <w:numId w:val="1003"/>
         </w:numPr>
       </w:pPr>
       <w:r>
@@ -891,25 +1098,123 @@
         <w:rPr>
           <w:rFonts w:hint="eastAsia"/>
         </w:rPr>
-        <w:t xml:space="preserve">程序会在原图上绘制绿色车辆框、红色含蓝光车辆框、蓝色车辆蓝光区域框、橙色环境干扰蓝光区域框，并在左上角输出</w:t>
-      </w:r>
-      <w:r>
-        <w:t xml:space="preserve"> vehicles、blue_vehicles、blue_regions </w:t>
-      </w:r>
-      <w:r>
-        <w:rPr>
-          <w:rFonts w:hint="eastAsia"/>
-        </w:rPr>
-        <w:t xml:space="preserve">等统计信息。对于视频输入，程序逐帧处理并生成带检测标注的</w:t>
-      </w:r>
-      <w:r>
-        <w:t xml:space="preserve"> MP4 </w:t>
-      </w:r>
-      <w:r>
-        <w:rPr>
-          <w:rFonts w:hint="eastAsia"/>
-        </w:rPr>
-        <w:t xml:space="preserve">文件。</w:t>
+        <w:t xml:space="preserve">程序在原图上绘制三类标注：</w:t>
+      </w:r>
+    </w:p>
+    <w:p>
+      <w:pPr>
+        <w:pStyle w:val="Compact"/>
+        <w:numPr>
+          <w:ilvl w:val="0"/>
+          <w:numId w:val="1004"/>
+        </w:numPr>
+      </w:pPr>
+      <w:r>
+        <w:rPr>
+          <w:rFonts w:hint="eastAsia"/>
+        </w:rPr>
+        <w:t xml:space="preserve">绿色框：普通车辆；</w:t>
+      </w:r>
+    </w:p>
+    <w:p>
+      <w:pPr>
+        <w:pStyle w:val="Compact"/>
+        <w:numPr>
+          <w:ilvl w:val="0"/>
+          <w:numId w:val="1004"/>
+        </w:numPr>
+      </w:pPr>
+      <w:r>
+        <w:rPr>
+          <w:rFonts w:hint="eastAsia"/>
+        </w:rPr>
+        <w:t xml:space="preserve">红色框：蓝光车灯车辆；</w:t>
+      </w:r>
+    </w:p>
+    <w:p>
+      <w:pPr>
+        <w:pStyle w:val="Compact"/>
+        <w:numPr>
+          <w:ilvl w:val="0"/>
+          <w:numId w:val="1004"/>
+        </w:numPr>
+      </w:pPr>
+      <w:r>
+        <w:rPr>
+          <w:rFonts w:hint="eastAsia"/>
+        </w:rPr>
+        <w:t xml:space="preserve">黄色框：蓝光反光车辆；</w:t>
+      </w:r>
+    </w:p>
+    <w:p>
+      <w:pPr>
+        <w:pStyle w:val="Compact"/>
+        <w:numPr>
+          <w:ilvl w:val="0"/>
+          <w:numId w:val="1004"/>
+        </w:numPr>
+      </w:pPr>
+      <w:r>
+        <w:rPr>
+          <w:rFonts w:hint="eastAsia"/>
+        </w:rPr>
+        <w:t xml:space="preserve">蓝色小框：车辆蓝光区域。</w:t>
+      </w:r>
+    </w:p>
+    <w:p>
+      <w:pPr>
+        <w:pStyle w:val="FirstParagraph"/>
+      </w:pPr>
+      <w:r>
+        <w:rPr>
+          <w:rFonts w:hint="eastAsia"/>
+        </w:rPr>
+        <w:t xml:space="preserve">左上角输出</w:t>
+      </w:r>
+      <w:r>
+        <w:t xml:space="preserve"> </w:t>
+      </w:r>
+      <w:r>
+        <w:rPr>
+          <w:rStyle w:val="VerbatimChar"/>
+        </w:rPr>
+        <w:t xml:space="preserve">vehicles</w:t>
+      </w:r>
+      <w:r>
+        <w:t xml:space="preserve">、</w:t>
+      </w:r>
+      <w:r>
+        <w:rPr>
+          <w:rStyle w:val="VerbatimChar"/>
+        </w:rPr>
+        <w:t xml:space="preserve">lamp_blue</w:t>
+      </w:r>
+      <w:r>
+        <w:t xml:space="preserve">、</w:t>
+      </w:r>
+      <w:r>
+        <w:rPr>
+          <w:rStyle w:val="VerbatimChar"/>
+        </w:rPr>
+        <w:t xml:space="preserve">reflect_blue</w:t>
+      </w:r>
+      <w:r>
+        <w:t xml:space="preserve">、</w:t>
+      </w:r>
+      <w:r>
+        <w:rPr>
+          <w:rStyle w:val="VerbatimChar"/>
+        </w:rPr>
+        <w:t xml:space="preserve">blue_regions</w:t>
+      </w:r>
+      <w:r>
+        <w:t xml:space="preserve"> </w:t>
+      </w:r>
+      <w:r>
+        <w:rPr>
+          <w:rFonts w:hint="eastAsia"/>
+        </w:rPr>
+        <w:t xml:space="preserve">等统计。环境干扰蓝光参与过滤逻辑，但不计入车辆蓝光数量。</w:t>
       </w:r>
     </w:p>
     <w:bookmarkEnd w:id="30"/>
@@ -933,16 +1238,7 @@
         <w:rPr>
           <w:rFonts w:hint="eastAsia"/>
         </w:rPr>
-        <w:t xml:space="preserve">综合准确性、可解释性、部署难度和作业要求，本方案选择轻量</w:t>
-      </w:r>
-      <w:r>
-        <w:t xml:space="preserve"> AI </w:t>
-      </w:r>
-      <w:r>
-        <w:rPr>
-          <w:rFonts w:hint="eastAsia"/>
-        </w:rPr>
-        <w:t xml:space="preserve">检测与传统图像处理融合的方式。AI</w:t>
+        <w:t xml:space="preserve">本方案不是全图亮点检测，也不是简单颜色分割，而是车辆优先的蓝光检测流程。YOLO</w:t>
       </w:r>
       <w:r>
         <w:t xml:space="preserve"> </w:t>
@@ -951,16 +1247,7 @@
         <w:rPr>
           <w:rFonts w:hint="eastAsia"/>
         </w:rPr>
-        <w:t xml:space="preserve">模型提供车辆位置先验，HSV</w:t>
-      </w:r>
-      <w:r>
-        <w:t xml:space="preserve"> </w:t>
-      </w:r>
-      <w:r>
-        <w:rPr>
-          <w:rFonts w:hint="eastAsia"/>
-        </w:rPr>
-        <w:t xml:space="preserve">阈值和形态学方法提供蓝光像素证据，空间关联逻辑过滤环境干扰，来源定位进一步满足拓展要求。该方案原理清晰、代码模块化、可在单帧和视频流上运行，符合高速监控蓝光检测任务要求。</w:t>
+        <w:t xml:space="preserve">提供可靠车辆框，成对车灯规则补足远处小车漏检，车身结构验证过滤路面和环境反光，车辆框内的位置约束进一步区分车灯蓝光和车辆反光蓝光。该方案更符合“识别带蓝光车灯/蓝光反光车辆，并过滤路牌、路灯等虚假蓝光干扰”的题目要求。</w:t>
       </w:r>
     </w:p>
     <w:bookmarkEnd w:id="31"/>
@@ -1183,6 +1470,15 @@
     <w:abstractNumId w:val="990"/>
   </w:num>
   <w:num w:numId="1001">
+    <w:abstractNumId w:val="991"/>
+  </w:num>
+  <w:num w:numId="1002">
+    <w:abstractNumId w:val="991"/>
+  </w:num>
+  <w:num w:numId="1003">
+    <w:abstractNumId w:val="991"/>
+  </w:num>
+  <w:num w:numId="1004">
     <w:abstractNumId w:val="991"/>
   </w:num>
 </w:numbering>

</xml_diff>

<commit_message>
Document left and right headlight detection
</commit_message>
<xml_diff>
--- a/blue-light-detection/解题技术思路和最优方案报告.docx
+++ b/blue-light-detection/解题技术思路和最优方案报告.docx
@@ -365,7 +365,7 @@
         <w:rPr>
           <w:rFonts w:hint="eastAsia"/>
         </w:rPr>
-        <w:t xml:space="preserve">漏检车辆的补充。</w:t>
+        <w:t xml:space="preserve">漏检车辆的补充。成对光斑中位于车辆框左半侧的候选记为左侧车灯蓝光，位于右半侧的候选记为右侧车灯蓝光，从而实现左右车灯的分别定位。</w:t>
       </w:r>
     </w:p>
     <w:bookmarkEnd w:id="24"/>
@@ -460,7 +460,7 @@
         <w:rPr>
           <w:rFonts w:hint="eastAsia"/>
         </w:rPr>
-        <w:t xml:space="preserve">对每个车辆框，先判断蓝光候选是否落入车辆内部。位于前灯/尾灯区域、且呈小型强光核心的候选判定为车灯蓝光，对应车辆使用红色框标注；位于车身、挡风玻璃或号牌附近的候选判定为车辆蓝光反光，对应车辆使用黄色框标注。未与车辆形成可靠空间关系的路牌、路灯、屏幕、柱体和地面反射判定为环境干扰蓝光并过滤。</w:t>
+        <w:t xml:space="preserve">对每个车辆框，先判断蓝光候选是否落入车辆内部。位于前灯/尾灯区域、且呈小型强光核心的候选判定为车灯蓝光，并根据候选中心点在车辆框内的横向位置识别为左侧车灯蓝光或右侧车灯蓝光，对应车辆使用红色框标注；位于车身、挡风玻璃或号牌附近的候选判定为车辆蓝光反光，对应车辆使用黄色框标注。未与车辆形成可靠空间关系的路牌、路灯、屏幕、柱体和地面反射判定为环境干扰蓝光并过滤。</w:t>
       </w:r>
     </w:p>
     <w:bookmarkEnd w:id="26"/>

</xml_diff>